<commit_message>
Corrige elegibilidade do NPS pos-compra
</commit_message>
<xml_diff>
--- a/output/doc/resumo_executivo_conta_azul.docx
+++ b/output/doc/resumo_executivo_conta_azul.docx
@@ -76,7 +76,7 @@
           <w:rFonts w:ascii="Calibri" w:hAnsi="Calibri"/>
           <w:sz w:val="20"/>
         </w:rPr>
-        <w:t>O NPS geral esconde diferencas importantes: compradores possuem NPS estimado de 33,33, enquanto nao compradores possuem NPS estimado de -29,46. Portanto, a experiencia dos usuarios que nao compram precisa ser investigada separadamente.</w:t>
+        <w:t>O NPS foi tratado como pesquisa pos-compra. Assim, o indicador final considera apenas compradores elegiveis: 741 respostas, NPS medio de 8,62 e NPS estimado de 33,33. As 465 respostas associadas a usuarios sem compra foram tratadas como ponto de investigacao, nao como NPS valido de nao compradores.</w:t>
       </w:r>
     </w:p>
     <w:p>
@@ -178,7 +178,7 @@
         <w:pStyle w:val="ListBullet"/>
       </w:pPr>
       <w:r>
-        <w:t>Investigar nao compradores com NPS baixo para identificar objeções, friccoes e lacunas de valor.</w:t>
+        <w:t>Investigar usuarios que nao compraram por pesquisa qualitativa, eventos de abandono e analise de jornada.</w:t>
       </w:r>
     </w:p>
     <w:p>

</xml_diff>

<commit_message>
Adiciona investigacao de NPS nao elegivel
</commit_message>
<xml_diff>
--- a/output/doc/resumo_executivo_conta_azul.docx
+++ b/output/doc/resumo_executivo_conta_azul.docx
@@ -77,6 +77,18 @@
           <w:sz w:val="20"/>
         </w:rPr>
         <w:t>O NPS foi tratado como pesquisa pos-compra. Assim, o indicador final considera apenas compradores elegiveis: 741 respostas, NPS medio de 8,62 e NPS estimado de 33,33. As 465 respostas associadas a usuarios sem compra foram tratadas como ponto de investigacao, nao como NPS valido de nao compradores.</w:t>
+      </w:r>
+    </w:p>
+    <w:p>
+      <w:pPr>
+        <w:spacing w:after="120" w:line="252" w:lineRule="auto"/>
+      </w:pPr>
+      <w:r>
+        <w:rPr>
+          <w:rFonts w:ascii="Calibri" w:hAnsi="Calibri"/>
+          <w:sz w:val="20"/>
+        </w:rPr>
+        <w:t>A investigacao desses 465 registros mostrou concentracao em organic (204), paid (130), mobile (280) e usuarios com signup sem compra (404). Isso sugere validar regra de disparo da pesquisa, tracking de purchase, janela de observacao e possivel survey de ativacao/trial.</w:t>
       </w:r>
     </w:p>
     <w:p>
@@ -179,6 +191,14 @@
       </w:pPr>
       <w:r>
         <w:t>Investigar usuarios que nao compraram por pesquisa qualitativa, eventos de abandono e analise de jornada.</w:t>
+      </w:r>
+    </w:p>
+    <w:p>
+      <w:pPr>
+        <w:pStyle w:val="ListBullet"/>
+      </w:pPr>
+      <w:r>
+        <w:t>Auditar respostas NPS nao elegiveis, principalmente em mobile, organic e paid.</w:t>
       </w:r>
     </w:p>
     <w:p>

</xml_diff>